<commit_message>
docs: add role-based guides and update VPS deployment
</commit_message>
<xml_diff>
--- a/docs/HUONG_DAN_CAI_DAT_VA_TRIEN_KHAI.docx
+++ b/docs/HUONG_DAN_CAI_DAT_VA_TRIEN_KHAI.docx
@@ -1930,7 +1930,7 @@
           <w:rFonts w:ascii="Consolas" w:hAnsi="Consolas"/>
           <w:sz w:val="18"/>
         </w:rPr>
-        <w:t>cd /hdd1/lab</w:t>
+        <w:t>cd /lab</w:t>
       </w:r>
       <w:r>
         <w:br/>
@@ -2312,7 +2312,7 @@
                 <w:color w:val="000000"/>
                 <w:sz w:val="20"/>
               </w:rPr>
-              <w:t>Thư mục dự án trên VPS; máy chủ hiện tại dùng /hdd1/lab</w:t>
+              <w:t>Thư mục dự án trên VPS; máy chủ hiện tại dùng /lab</w:t>
             </w:r>
           </w:p>
         </w:tc>

</xml_diff>